<commit_message>
updated README with Checkpoint 7.1
</commit_message>
<xml_diff>
--- a/Checkpoint 5.1/Required_Capstone_Checkpoint_5_1_Worksheet-1.docx
+++ b/Checkpoint 5.1/Required_Capstone_Checkpoint_5_1_Worksheet-1.docx
@@ -3771,17 +3771,8 @@
                       <w:sz w:val="24"/>
                       <w:szCs w:val="24"/>
                     </w:rPr>
-                    <w:t xml:space="preserve">Mean graded </w:t>
+                    <w:t>Mean graded groundedness</w:t>
                   </w:r>
-                  <w:proofErr w:type="spellStart"/>
-                  <w:r>
-                    <w:rPr>
-                      <w:sz w:val="24"/>
-                      <w:szCs w:val="24"/>
-                    </w:rPr>
-                    <w:t>groundedness</w:t>
-                  </w:r>
-                  <w:proofErr w:type="spellEnd"/>
                 </w:p>
               </w:tc>
               <w:tc>
@@ -22211,17 +22202,8 @@
                       <w:sz w:val="24"/>
                       <w:szCs w:val="24"/>
                     </w:rPr>
-                    <w:t xml:space="preserve">Mean graded </w:t>
+                    <w:t>Mean graded groundedness</w:t>
                   </w:r>
-                  <w:proofErr w:type="spellStart"/>
-                  <w:r>
-                    <w:rPr>
-                      <w:sz w:val="24"/>
-                      <w:szCs w:val="24"/>
-                    </w:rPr>
-                    <w:t>groundedness</w:t>
-                  </w:r>
-                  <w:proofErr w:type="spellEnd"/>
                 </w:p>
               </w:tc>
               <w:tc>
@@ -24136,17 +24118,8 @@
                       <w:sz w:val="24"/>
                       <w:szCs w:val="24"/>
                     </w:rPr>
-                    <w:t xml:space="preserve">Mean graded </w:t>
+                    <w:t>Mean graded groundedness</w:t>
                   </w:r>
-                  <w:proofErr w:type="spellStart"/>
-                  <w:r>
-                    <w:rPr>
-                      <w:sz w:val="24"/>
-                      <w:szCs w:val="24"/>
-                    </w:rPr>
-                    <w:t>groundedness</w:t>
-                  </w:r>
-                  <w:proofErr w:type="spellEnd"/>
                 </w:p>
               </w:tc>
               <w:tc>
@@ -26863,22 +26836,6 @@
               </w:rPr>
             </w:pPr>
           </w:p>
-          <w:p>
-            <w:pPr>
-              <w:rPr>
-                <w:sz w:val="24"/>
-                <w:szCs w:val="24"/>
-              </w:rPr>
-            </w:pPr>
-          </w:p>
-          <w:p>
-            <w:pPr>
-              <w:rPr>
-                <w:sz w:val="24"/>
-                <w:szCs w:val="24"/>
-              </w:rPr>
-            </w:pPr>
-          </w:p>
         </w:tc>
       </w:tr>
       <w:tr>
@@ -26931,22 +26888,6 @@
               </w:rPr>
             </w:pPr>
           </w:p>
-          <w:p>
-            <w:pPr>
-              <w:rPr>
-                <w:sz w:val="24"/>
-                <w:szCs w:val="24"/>
-              </w:rPr>
-            </w:pPr>
-          </w:p>
-          <w:p>
-            <w:pPr>
-              <w:rPr>
-                <w:sz w:val="24"/>
-                <w:szCs w:val="24"/>
-              </w:rPr>
-            </w:pPr>
-          </w:p>
         </w:tc>
       </w:tr>
       <w:tr>
@@ -26974,7 +26915,6 @@
                 <w:rFonts w:ascii="Aptos" w:hAnsi="Aptos"/>
                 <w:color w:val="000000"/>
               </w:rPr>
-              <w:lastRenderedPageBreak/>
               <w:t>Screenshots or diagrams</w:t>
             </w:r>
             <w:r>
@@ -30720,6 +30660,7 @@
   <w:style w:type="character" w:default="1" w:styleId="DefaultParagraphFont">
     <w:name w:val="Default Paragraph Font"/>
     <w:uiPriority w:val="1"/>
+    <w:semiHidden/>
     <w:unhideWhenUsed/>
   </w:style>
   <w:style w:type="table" w:default="1" w:styleId="TableNormal">

</xml_diff>